<commit_message>
fix(1.2): shorten table-cell underscores to prevent .docx wrap
</commit_message>
<xml_diff>
--- a/frontend/public/resources/1.2-mtss-team-roles.docx
+++ b/frontend/public/resources/1.2-mtss-team-roles.docx
@@ -563,8 +563,7 @@
     <w:tbl>
       <w:tblPr>
         <w:tblStyle w:val="Table"/>
-        <w:tblW w:type="pct" w:w="5000"/>
-        <w:tblLayout w:type="fixed"/>
+        <w:tblW w:type="auto" w:w="0"/>
         <w:tblLook w:firstRow="1" w:lastRow="0" w:firstColumn="0" w:lastColumn="0" w:noHBand="0" w:noVBand="0" w:val="0020"/>
       </w:tblPr>
       <w:tblGrid>
@@ -618,7 +617,7 @@
               <w:pStyle w:val="Compact"/>
             </w:pPr>
             <w:r>
-              <w:t xml:space="preserve">_________________________</w:t>
+              <w:t xml:space="preserve">____________</w:t>
             </w:r>
           </w:p>
         </w:tc>
@@ -640,7 +639,7 @@
               <w:pStyle w:val="Compact"/>
             </w:pPr>
             <w:r>
-              <w:t xml:space="preserve">_________________________</w:t>
+              <w:t xml:space="preserve">____________</w:t>
             </w:r>
           </w:p>
         </w:tc>
@@ -653,7 +652,7 @@
               <w:pStyle w:val="Compact"/>
             </w:pPr>
             <w:r>
-              <w:t xml:space="preserve">_________________________</w:t>
+              <w:t xml:space="preserve">____________</w:t>
             </w:r>
           </w:p>
         </w:tc>
@@ -664,7 +663,7 @@
               <w:pStyle w:val="Compact"/>
             </w:pPr>
             <w:r>
-              <w:t xml:space="preserve">_________________________</w:t>
+              <w:t xml:space="preserve">____________</w:t>
             </w:r>
           </w:p>
         </w:tc>
@@ -675,7 +674,7 @@
               <w:pStyle w:val="Compact"/>
             </w:pPr>
             <w:r>
-              <w:t xml:space="preserve">_________________________</w:t>
+              <w:t xml:space="preserve">____________</w:t>
             </w:r>
           </w:p>
         </w:tc>
@@ -688,7 +687,7 @@
               <w:pStyle w:val="Compact"/>
             </w:pPr>
             <w:r>
-              <w:t xml:space="preserve">_________________________</w:t>
+              <w:t xml:space="preserve">____________</w:t>
             </w:r>
           </w:p>
         </w:tc>
@@ -699,7 +698,7 @@
               <w:pStyle w:val="Compact"/>
             </w:pPr>
             <w:r>
-              <w:t xml:space="preserve">_________________________</w:t>
+              <w:t xml:space="preserve">____________</w:t>
             </w:r>
           </w:p>
         </w:tc>
@@ -710,7 +709,7 @@
               <w:pStyle w:val="Compact"/>
             </w:pPr>
             <w:r>
-              <w:t xml:space="preserve">_________________________</w:t>
+              <w:t xml:space="preserve">____________</w:t>
             </w:r>
           </w:p>
         </w:tc>
@@ -723,7 +722,7 @@
               <w:pStyle w:val="Compact"/>
             </w:pPr>
             <w:r>
-              <w:t xml:space="preserve">_________________________</w:t>
+              <w:t xml:space="preserve">____________</w:t>
             </w:r>
           </w:p>
         </w:tc>
@@ -734,7 +733,7 @@
               <w:pStyle w:val="Compact"/>
             </w:pPr>
             <w:r>
-              <w:t xml:space="preserve">_________________________</w:t>
+              <w:t xml:space="preserve">____________</w:t>
             </w:r>
           </w:p>
         </w:tc>
@@ -745,7 +744,7 @@
               <w:pStyle w:val="Compact"/>
             </w:pPr>
             <w:r>
-              <w:t xml:space="preserve">_________________________</w:t>
+              <w:t xml:space="preserve">____________</w:t>
             </w:r>
           </w:p>
         </w:tc>
@@ -758,7 +757,7 @@
               <w:pStyle w:val="Compact"/>
             </w:pPr>
             <w:r>
-              <w:t xml:space="preserve">_________________________</w:t>
+              <w:t xml:space="preserve">____________</w:t>
             </w:r>
           </w:p>
         </w:tc>
@@ -769,7 +768,7 @@
               <w:pStyle w:val="Compact"/>
             </w:pPr>
             <w:r>
-              <w:t xml:space="preserve">_________________________</w:t>
+              <w:t xml:space="preserve">____________</w:t>
             </w:r>
           </w:p>
         </w:tc>
@@ -780,7 +779,7 @@
               <w:pStyle w:val="Compact"/>
             </w:pPr>
             <w:r>
-              <w:t xml:space="preserve">_________________________</w:t>
+              <w:t xml:space="preserve">____________</w:t>
             </w:r>
           </w:p>
         </w:tc>
@@ -793,7 +792,7 @@
               <w:pStyle w:val="Compact"/>
             </w:pPr>
             <w:r>
-              <w:t xml:space="preserve">_________________________</w:t>
+              <w:t xml:space="preserve">____________</w:t>
             </w:r>
           </w:p>
         </w:tc>
@@ -804,7 +803,7 @@
               <w:pStyle w:val="Compact"/>
             </w:pPr>
             <w:r>
-              <w:t xml:space="preserve">_________________________</w:t>
+              <w:t xml:space="preserve">____________</w:t>
             </w:r>
           </w:p>
         </w:tc>
@@ -815,7 +814,7 @@
               <w:pStyle w:val="Compact"/>
             </w:pPr>
             <w:r>
-              <w:t xml:space="preserve">_________________________</w:t>
+              <w:t xml:space="preserve">____________</w:t>
             </w:r>
           </w:p>
         </w:tc>

</xml_diff>